<commit_message>
Fix demo-admin delete flow
</commit_message>
<xml_diff>
--- a/docs/テスト手順（会員側）.docx
+++ b/docs/テスト手順（会員側）.docx
@@ -62,13 +62,38 @@
       </w:r>
       <w:r>
         <w:rPr>
-          <w:rFonts w:ascii="ＭＳ Ｐゴシック" w:eastAsia="ＭＳ Ｐゴシック" w:hAnsi="ＭＳ Ｐゴシック" w:cs="ＭＳ Ｐゴシック"/>
-          <w:kern w:val="0"/>
-          <w:sz w:val="24"/>
-          <w:szCs w:val="24"/>
-          <w14:ligatures w14:val="none"/>
-        </w:rPr>
-        <w:t xml:space="preserve"> → （本番移行後に記載）</w:t>
+          <w:rFonts w:ascii="ＭＳ Ｐゴシック" w:eastAsia="ＭＳ Ｐゴシック" w:hAnsi="ＭＳ Ｐゴシック" w:cs="ＭＳ Ｐゴシック" w:hint="eastAsia"/>
+          <w:kern w:val="0"/>
+          <w:sz w:val="24"/>
+          <w:szCs w:val="24"/>
+          <w14:ligatures w14:val="none"/>
+        </w:rPr>
+        <w:t>：</w:t>
+      </w:r>
+    </w:p>
+    <w:p>
+      <w:pPr>
+        <w:widowControl/>
+        <w:spacing w:before="100" w:beforeAutospacing="1" w:after="100" w:afterAutospacing="1"/>
+        <w:ind w:left="720"/>
+        <w:jc w:val="left"/>
+        <w:rPr>
+          <w:rFonts w:ascii="ＭＳ Ｐゴシック" w:eastAsia="ＭＳ Ｐゴシック" w:hAnsi="ＭＳ Ｐゴシック" w:cs="ＭＳ Ｐゴシック"/>
+          <w:kern w:val="0"/>
+          <w:sz w:val="24"/>
+          <w:szCs w:val="24"/>
+          <w14:ligatures w14:val="none"/>
+        </w:rPr>
+      </w:pPr>
+      <w:r>
+        <w:rPr>
+          <w:rFonts w:ascii="ＭＳ Ｐゴシック" w:eastAsia="ＭＳ Ｐゴシック" w:hAnsi="ＭＳ Ｐゴシック" w:cs="ＭＳ Ｐゴシック"/>
+          <w:kern w:val="0"/>
+          <w:sz w:val="24"/>
+          <w:szCs w:val="24"/>
+          <w14:ligatures w14:val="none"/>
+        </w:rPr>
+        <w:t>https://membership-management-system-production.up.railway.app/</w:t>
       </w:r>
     </w:p>
     <w:p>
@@ -148,7 +173,7 @@
         <w:ind w:left="720"/>
         <w:jc w:val="left"/>
         <w:rPr>
-          <w:rFonts w:ascii="ＭＳ Ｐゴシック" w:eastAsia="ＭＳ Ｐゴシック" w:hAnsi="ＭＳ Ｐゴシック" w:cs="ＭＳ Ｐゴシック" w:hint="eastAsia"/>
+          <w:rFonts w:ascii="ＭＳ Ｐゴシック" w:eastAsia="ＭＳ Ｐゴシック" w:hAnsi="ＭＳ Ｐゴシック" w:cs="ＭＳ Ｐゴシック"/>
           <w:kern w:val="0"/>
           <w:sz w:val="24"/>
           <w:szCs w:val="24"/>
@@ -382,13 +407,13 @@
       </w:pPr>
       <w:r>
         <w:rPr>
-          <w:rFonts w:ascii="ＭＳ Ｐゴシック" w:eastAsia="ＭＳ Ｐゴシック" w:hAnsi="ＭＳ Ｐゴシック" w:cs="ＭＳ Ｐゴシック"/>
-          <w:kern w:val="0"/>
-          <w:sz w:val="24"/>
-          <w:szCs w:val="24"/>
-          <w14:ligatures w14:val="none"/>
-        </w:rPr>
-        <w:t>会員画面のトップページを開く</w:t>
+          <w:rFonts w:ascii="ＭＳ Ｐゴシック" w:eastAsia="ＭＳ Ｐゴシック" w:hAnsi="ＭＳ Ｐゴシック" w:cs="ＭＳ Ｐゴシック" w:hint="eastAsia"/>
+          <w:kern w:val="0"/>
+          <w:sz w:val="24"/>
+          <w:szCs w:val="24"/>
+          <w14:ligatures w14:val="none"/>
+        </w:rPr>
+        <w:t>URLにアクセスする</w:t>
       </w:r>
     </w:p>
     <w:p>
@@ -416,7 +441,7 @@
           <w:szCs w:val="24"/>
           <w14:ligatures w14:val="none"/>
         </w:rPr>
-        <w:t>「新規会員登録」をクリック</w:t>
+        <w:t>「会員登録」をクリック</w:t>
       </w:r>
     </w:p>
     <w:p>
@@ -566,7 +591,27 @@
           <w:szCs w:val="24"/>
           <w14:ligatures w14:val="none"/>
         </w:rPr>
-        <w:t>住所（自動入力されます）</w:t>
+        <w:t>住所（</w:t>
+      </w:r>
+      <w:r>
+        <w:rPr>
+          <w:rFonts w:ascii="ＭＳ Ｐゴシック" w:eastAsia="ＭＳ Ｐゴシック" w:hAnsi="ＭＳ Ｐゴシック" w:cs="ＭＳ Ｐゴシック" w:hint="eastAsia"/>
+          <w:kern w:val="0"/>
+          <w:sz w:val="24"/>
+          <w:szCs w:val="24"/>
+          <w14:ligatures w14:val="none"/>
+        </w:rPr>
+        <w:t>検索ボタンで途中まで</w:t>
+      </w:r>
+      <w:r>
+        <w:rPr>
+          <w:rFonts w:ascii="ＭＳ Ｐゴシック" w:eastAsia="ＭＳ Ｐゴシック" w:hAnsi="ＭＳ Ｐゴシック" w:cs="ＭＳ Ｐゴシック"/>
+          <w:kern w:val="0"/>
+          <w:sz w:val="24"/>
+          <w:szCs w:val="24"/>
+          <w14:ligatures w14:val="none"/>
+        </w:rPr>
+        <w:t>自動入力されます）</w:t>
       </w:r>
     </w:p>
     <w:p>
@@ -736,6 +781,7 @@
           <w:szCs w:val="24"/>
           <w14:ligatures w14:val="none"/>
         </w:rPr>
+        <w:lastRenderedPageBreak/>
         <w:t>入力したメールアドレスに「登録完了メール」が届きます</w:t>
       </w:r>
     </w:p>
@@ -793,7 +839,6 @@
           <w:szCs w:val="24"/>
           <w14:ligatures w14:val="none"/>
         </w:rPr>
-        <w:lastRenderedPageBreak/>
         <w:t>登録したメールアドレスとパスワードを入力</w:t>
       </w:r>
     </w:p>
@@ -1546,6 +1591,7 @@
           <w:szCs w:val="24"/>
           <w14:ligatures w14:val="none"/>
         </w:rPr>
+        <w:lastRenderedPageBreak/>
         <w:t>ステータスが「活動中」に戻ります</w:t>
       </w:r>
     </w:p>
@@ -1603,7 +1649,6 @@
           <w:szCs w:val="24"/>
           <w14:ligatures w14:val="none"/>
         </w:rPr>
-        <w:lastRenderedPageBreak/>
         <w:t>マイページで「退会する」をクリック</w:t>
       </w:r>
     </w:p>
@@ -1688,10 +1733,291 @@
           <w:szCs w:val="24"/>
           <w14:ligatures w14:val="none"/>
         </w:rPr>
-        <w:t>メールに「退会完了メール」が届きます</w:t>
-      </w:r>
-    </w:p>
-    <w:p/>
+        <w:t>メールに「退会完了メー」が届きます</w:t>
+      </w:r>
+      <w:r>
+        <w:rPr>
+          <w:rFonts w:ascii="ＭＳ Ｐゴシック" w:eastAsia="ＭＳ Ｐゴシック" w:hAnsi="ＭＳ Ｐゴシック" w:cs="ＭＳ Ｐゴシック"/>
+          <w:kern w:val="0"/>
+          <w:sz w:val="24"/>
+          <w:szCs w:val="24"/>
+          <w14:ligatures w14:val="none"/>
+        </w:rPr>
+        <w:tab/>
+      </w:r>
+    </w:p>
+    <w:p>
+      <w:pPr>
+        <w:widowControl/>
+        <w:spacing w:before="100" w:beforeAutospacing="1" w:after="100" w:afterAutospacing="1"/>
+        <w:jc w:val="left"/>
+        <w:outlineLvl w:val="2"/>
+        <w:rPr>
+          <w:rFonts w:ascii="ＭＳ Ｐゴシック" w:eastAsia="ＭＳ Ｐゴシック" w:hAnsi="ＭＳ Ｐゴシック" w:cs="ＭＳ Ｐゴシック" w:hint="eastAsia"/>
+          <w:b/>
+          <w:bCs/>
+          <w:kern w:val="0"/>
+          <w:sz w:val="27"/>
+          <w:szCs w:val="27"/>
+          <w14:ligatures w14:val="none"/>
+        </w:rPr>
+      </w:pPr>
+      <w:r>
+        <w:rPr>
+          <w:rFonts w:ascii="ＭＳ Ｐゴシック" w:eastAsia="ＭＳ Ｐゴシック" w:hAnsi="ＭＳ Ｐゴシック" w:cs="ＭＳ Ｐゴシック" w:hint="eastAsia"/>
+          <w:b/>
+          <w:bCs/>
+          <w:kern w:val="0"/>
+          <w:sz w:val="27"/>
+          <w:szCs w:val="27"/>
+          <w14:ligatures w14:val="none"/>
+        </w:rPr>
+        <w:t>⑧</w:t>
+      </w:r>
+      <w:r>
+        <w:rPr>
+          <w:rFonts w:ascii="ＭＳ Ｐゴシック" w:eastAsia="ＭＳ Ｐゴシック" w:hAnsi="ＭＳ Ｐゴシック" w:cs="ＭＳ Ｐゴシック"/>
+          <w:b/>
+          <w:bCs/>
+          <w:kern w:val="0"/>
+          <w:sz w:val="27"/>
+          <w:szCs w:val="27"/>
+          <w14:ligatures w14:val="none"/>
+        </w:rPr>
+        <w:t xml:space="preserve"> </w:t>
+      </w:r>
+      <w:r>
+        <w:rPr>
+          <w:rFonts w:ascii="ＭＳ Ｐゴシック" w:eastAsia="ＭＳ Ｐゴシック" w:hAnsi="ＭＳ Ｐゴシック" w:cs="ＭＳ Ｐゴシック" w:hint="eastAsia"/>
+          <w:b/>
+          <w:bCs/>
+          <w:kern w:val="0"/>
+          <w:sz w:val="27"/>
+          <w:szCs w:val="27"/>
+          <w14:ligatures w14:val="none"/>
+        </w:rPr>
+        <w:t>パスワードを忘れた場合</w:t>
+      </w:r>
+    </w:p>
+    <w:p>
+      <w:pPr>
+        <w:widowControl/>
+        <w:numPr>
+          <w:ilvl w:val="0"/>
+          <w:numId w:val="16"/>
+        </w:numPr>
+        <w:spacing w:before="100" w:beforeAutospacing="1" w:after="100" w:afterAutospacing="1"/>
+        <w:jc w:val="left"/>
+        <w:rPr>
+          <w:rFonts w:ascii="ＭＳ Ｐゴシック" w:eastAsia="ＭＳ Ｐゴシック" w:hAnsi="ＭＳ Ｐゴシック" w:cs="ＭＳ Ｐゴシック"/>
+          <w:kern w:val="0"/>
+          <w:sz w:val="24"/>
+          <w:szCs w:val="24"/>
+          <w14:ligatures w14:val="none"/>
+        </w:rPr>
+      </w:pPr>
+      <w:r>
+        <w:rPr>
+          <w:rFonts w:ascii="ＭＳ Ｐゴシック" w:eastAsia="ＭＳ Ｐゴシック" w:hAnsi="ＭＳ Ｐゴシック" w:cs="ＭＳ Ｐゴシック" w:hint="eastAsia"/>
+          <w:kern w:val="0"/>
+          <w:sz w:val="24"/>
+          <w:szCs w:val="24"/>
+          <w14:ligatures w14:val="none"/>
+        </w:rPr>
+        <w:t>メニューの</w:t>
+      </w:r>
+      <w:r>
+        <w:rPr>
+          <w:rFonts w:ascii="ＭＳ Ｐゴシック" w:eastAsia="ＭＳ Ｐゴシック" w:hAnsi="ＭＳ Ｐゴシック" w:cs="ＭＳ Ｐゴシック"/>
+          <w:kern w:val="0"/>
+          <w:sz w:val="24"/>
+          <w:szCs w:val="24"/>
+          <w14:ligatures w14:val="none"/>
+        </w:rPr>
+        <w:t>「</w:t>
+      </w:r>
+      <w:r>
+        <w:rPr>
+          <w:rFonts w:ascii="ＭＳ Ｐゴシック" w:eastAsia="ＭＳ Ｐゴシック" w:hAnsi="ＭＳ Ｐゴシック" w:cs="ＭＳ Ｐゴシック" w:hint="eastAsia"/>
+          <w:kern w:val="0"/>
+          <w:sz w:val="24"/>
+          <w:szCs w:val="24"/>
+          <w14:ligatures w14:val="none"/>
+        </w:rPr>
+        <w:t>会員ログイン」をクリック</w:t>
+      </w:r>
+    </w:p>
+    <w:p>
+      <w:pPr>
+        <w:widowControl/>
+        <w:numPr>
+          <w:ilvl w:val="0"/>
+          <w:numId w:val="16"/>
+        </w:numPr>
+        <w:spacing w:before="100" w:beforeAutospacing="1" w:after="100" w:afterAutospacing="1"/>
+        <w:jc w:val="left"/>
+        <w:rPr>
+          <w:rFonts w:ascii="ＭＳ Ｐゴシック" w:eastAsia="ＭＳ Ｐゴシック" w:hAnsi="ＭＳ Ｐゴシック" w:cs="ＭＳ Ｐゴシック"/>
+          <w:kern w:val="0"/>
+          <w:sz w:val="24"/>
+          <w:szCs w:val="24"/>
+          <w14:ligatures w14:val="none"/>
+        </w:rPr>
+      </w:pPr>
+      <w:r>
+        <w:rPr>
+          <w:rFonts w:ascii="ＭＳ Ｐゴシック" w:eastAsia="ＭＳ Ｐゴシック" w:hAnsi="ＭＳ Ｐゴシック" w:cs="ＭＳ Ｐゴシック" w:hint="eastAsia"/>
+          <w:kern w:val="0"/>
+          <w:sz w:val="24"/>
+          <w:szCs w:val="24"/>
+          <w14:ligatures w14:val="none"/>
+        </w:rPr>
+        <w:t>表示されたページで自分のメールアドレスを入力</w:t>
+      </w:r>
+    </w:p>
+    <w:p>
+      <w:pPr>
+        <w:widowControl/>
+        <w:numPr>
+          <w:ilvl w:val="0"/>
+          <w:numId w:val="16"/>
+        </w:numPr>
+        <w:spacing w:before="100" w:beforeAutospacing="1" w:after="100" w:afterAutospacing="1"/>
+        <w:jc w:val="left"/>
+        <w:rPr>
+          <w:rFonts w:ascii="ＭＳ Ｐゴシック" w:eastAsia="ＭＳ Ｐゴシック" w:hAnsi="ＭＳ Ｐゴシック" w:cs="ＭＳ Ｐゴシック"/>
+          <w:kern w:val="0"/>
+          <w:sz w:val="24"/>
+          <w:szCs w:val="24"/>
+          <w14:ligatures w14:val="none"/>
+        </w:rPr>
+      </w:pPr>
+      <w:r>
+        <w:rPr>
+          <w:rFonts w:ascii="ＭＳ Ｐゴシック" w:eastAsia="ＭＳ Ｐゴシック" w:hAnsi="ＭＳ Ｐゴシック" w:cs="ＭＳ Ｐゴシック" w:hint="eastAsia"/>
+          <w:kern w:val="0"/>
+          <w:sz w:val="24"/>
+          <w:szCs w:val="24"/>
+          <w14:ligatures w14:val="none"/>
+        </w:rPr>
+        <w:t>送信ボタンクリック</w:t>
+      </w:r>
+    </w:p>
+    <w:p>
+      <w:pPr>
+        <w:widowControl/>
+        <w:numPr>
+          <w:ilvl w:val="0"/>
+          <w:numId w:val="16"/>
+        </w:numPr>
+        <w:spacing w:before="100" w:beforeAutospacing="1" w:after="100" w:afterAutospacing="1"/>
+        <w:jc w:val="left"/>
+        <w:rPr>
+          <w:rFonts w:ascii="ＭＳ Ｐゴシック" w:eastAsia="ＭＳ Ｐゴシック" w:hAnsi="ＭＳ Ｐゴシック" w:cs="ＭＳ Ｐゴシック"/>
+          <w:kern w:val="0"/>
+          <w:sz w:val="24"/>
+          <w:szCs w:val="24"/>
+          <w14:ligatures w14:val="none"/>
+        </w:rPr>
+      </w:pPr>
+      <w:r>
+        <w:rPr>
+          <w:rFonts w:ascii="ＭＳ Ｐゴシック" w:eastAsia="ＭＳ Ｐゴシック" w:hAnsi="ＭＳ Ｐゴシック" w:cs="ＭＳ Ｐゴシック" w:hint="eastAsia"/>
+          <w:kern w:val="0"/>
+          <w:sz w:val="24"/>
+          <w:szCs w:val="24"/>
+          <w14:ligatures w14:val="none"/>
+        </w:rPr>
+        <w:t>自分のメールアドレスにパスワードリセットメールが届く</w:t>
+      </w:r>
+    </w:p>
+    <w:p>
+      <w:pPr>
+        <w:widowControl/>
+        <w:numPr>
+          <w:ilvl w:val="0"/>
+          <w:numId w:val="16"/>
+        </w:numPr>
+        <w:spacing w:before="100" w:beforeAutospacing="1" w:after="100" w:afterAutospacing="1"/>
+        <w:jc w:val="left"/>
+        <w:rPr>
+          <w:rFonts w:ascii="ＭＳ Ｐゴシック" w:eastAsia="ＭＳ Ｐゴシック" w:hAnsi="ＭＳ Ｐゴシック" w:cs="ＭＳ Ｐゴシック"/>
+          <w:kern w:val="0"/>
+          <w:sz w:val="24"/>
+          <w:szCs w:val="24"/>
+          <w14:ligatures w14:val="none"/>
+        </w:rPr>
+      </w:pPr>
+      <w:r>
+        <w:rPr>
+          <w:rFonts w:ascii="ＭＳ Ｐゴシック" w:eastAsia="ＭＳ Ｐゴシック" w:hAnsi="ＭＳ Ｐゴシック" w:cs="ＭＳ Ｐゴシック" w:hint="eastAsia"/>
+          <w:kern w:val="0"/>
+          <w:sz w:val="24"/>
+          <w:szCs w:val="24"/>
+          <w14:ligatures w14:val="none"/>
+        </w:rPr>
+        <w:t>自分のメールアカウントに届いたメールを開いて、URLをクリックする</w:t>
+      </w:r>
+    </w:p>
+    <w:p>
+      <w:pPr>
+        <w:widowControl/>
+        <w:numPr>
+          <w:ilvl w:val="0"/>
+          <w:numId w:val="16"/>
+        </w:numPr>
+        <w:spacing w:before="100" w:beforeAutospacing="1" w:after="100" w:afterAutospacing="1"/>
+        <w:jc w:val="left"/>
+        <w:rPr>
+          <w:rFonts w:ascii="ＭＳ Ｐゴシック" w:eastAsia="ＭＳ Ｐゴシック" w:hAnsi="ＭＳ Ｐゴシック" w:cs="ＭＳ Ｐゴシック"/>
+          <w:kern w:val="0"/>
+          <w:sz w:val="24"/>
+          <w:szCs w:val="24"/>
+          <w14:ligatures w14:val="none"/>
+        </w:rPr>
+      </w:pPr>
+      <w:r>
+        <w:rPr>
+          <w:rFonts w:ascii="ＭＳ Ｐゴシック" w:eastAsia="ＭＳ Ｐゴシック" w:hAnsi="ＭＳ Ｐゴシック" w:cs="ＭＳ Ｐゴシック" w:hint="eastAsia"/>
+          <w:kern w:val="0"/>
+          <w:sz w:val="24"/>
+          <w:szCs w:val="24"/>
+          <w14:ligatures w14:val="none"/>
+        </w:rPr>
+        <w:t>新しいパスワードと確認用パスワードを入力して登録ボタンをクリック</w:t>
+      </w:r>
+    </w:p>
+    <w:p>
+      <w:pPr>
+        <w:widowControl/>
+        <w:spacing w:before="100" w:beforeAutospacing="1" w:after="100" w:afterAutospacing="1"/>
+        <w:jc w:val="left"/>
+      </w:pPr>
+    </w:p>
+    <w:p>
+      <w:pPr>
+        <w:widowControl/>
+        <w:spacing w:before="100" w:beforeAutospacing="1" w:after="100" w:afterAutospacing="1"/>
+        <w:jc w:val="left"/>
+        <w:rPr>
+          <w:rFonts w:ascii="ＭＳ Ｐゴシック" w:eastAsia="ＭＳ Ｐゴシック" w:hAnsi="ＭＳ Ｐゴシック" w:cs="ＭＳ Ｐゴシック" w:hint="eastAsia"/>
+          <w:kern w:val="0"/>
+          <w:sz w:val="24"/>
+          <w:szCs w:val="24"/>
+          <w14:ligatures w14:val="none"/>
+        </w:rPr>
+      </w:pPr>
+      <w:r>
+        <w:rPr>
+          <w:rFonts w:ascii="ＭＳ Ｐゴシック" w:eastAsia="ＭＳ Ｐゴシック" w:hAnsi="ＭＳ Ｐゴシック" w:cs="ＭＳ Ｐゴシック" w:hint="eastAsia"/>
+          <w:kern w:val="0"/>
+          <w:sz w:val="24"/>
+          <w:szCs w:val="24"/>
+          <w14:ligatures w14:val="none"/>
+        </w:rPr>
+        <w:t xml:space="preserve">　</w:t>
+      </w:r>
+    </w:p>
     <w:sectPr>
       <w:pgSz w:w="11906" w:h="16838"/>
       <w:pgMar w:top="1985" w:right="1701" w:bottom="1701" w:left="1701" w:header="851" w:footer="992" w:gutter="0"/>
@@ -3324,6 +3650,119 @@
     </w:lvl>
   </w:abstractNum>
   <w:abstractNum w:abstractNumId="13" w15:restartNumberingAfterBreak="0">
+    <w:nsid w:val="73030F62"/>
+    <w:multiLevelType w:val="multilevel"/>
+    <w:tmpl w:val="497A38D0"/>
+    <w:lvl w:ilvl="0">
+      <w:start w:val="1"/>
+      <w:numFmt w:val="decimal"/>
+      <w:lvlText w:val="%1."/>
+      <w:lvlJc w:val="left"/>
+      <w:pPr>
+        <w:tabs>
+          <w:tab w:val="num" w:pos="720"/>
+        </w:tabs>
+        <w:ind w:left="720" w:hanging="360"/>
+      </w:pPr>
+    </w:lvl>
+    <w:lvl w:ilvl="1" w:tentative="1">
+      <w:start w:val="1"/>
+      <w:numFmt w:val="decimal"/>
+      <w:lvlText w:val="%2."/>
+      <w:lvlJc w:val="left"/>
+      <w:pPr>
+        <w:tabs>
+          <w:tab w:val="num" w:pos="1440"/>
+        </w:tabs>
+        <w:ind w:left="1440" w:hanging="360"/>
+      </w:pPr>
+    </w:lvl>
+    <w:lvl w:ilvl="2" w:tentative="1">
+      <w:start w:val="1"/>
+      <w:numFmt w:val="decimal"/>
+      <w:lvlText w:val="%3."/>
+      <w:lvlJc w:val="left"/>
+      <w:pPr>
+        <w:tabs>
+          <w:tab w:val="num" w:pos="2160"/>
+        </w:tabs>
+        <w:ind w:left="2160" w:hanging="360"/>
+      </w:pPr>
+    </w:lvl>
+    <w:lvl w:ilvl="3" w:tentative="1">
+      <w:start w:val="1"/>
+      <w:numFmt w:val="decimal"/>
+      <w:lvlText w:val="%4."/>
+      <w:lvlJc w:val="left"/>
+      <w:pPr>
+        <w:tabs>
+          <w:tab w:val="num" w:pos="2880"/>
+        </w:tabs>
+        <w:ind w:left="2880" w:hanging="360"/>
+      </w:pPr>
+    </w:lvl>
+    <w:lvl w:ilvl="4" w:tentative="1">
+      <w:start w:val="1"/>
+      <w:numFmt w:val="decimal"/>
+      <w:lvlText w:val="%5."/>
+      <w:lvlJc w:val="left"/>
+      <w:pPr>
+        <w:tabs>
+          <w:tab w:val="num" w:pos="3600"/>
+        </w:tabs>
+        <w:ind w:left="3600" w:hanging="360"/>
+      </w:pPr>
+    </w:lvl>
+    <w:lvl w:ilvl="5" w:tentative="1">
+      <w:start w:val="1"/>
+      <w:numFmt w:val="decimal"/>
+      <w:lvlText w:val="%6."/>
+      <w:lvlJc w:val="left"/>
+      <w:pPr>
+        <w:tabs>
+          <w:tab w:val="num" w:pos="4320"/>
+        </w:tabs>
+        <w:ind w:left="4320" w:hanging="360"/>
+      </w:pPr>
+    </w:lvl>
+    <w:lvl w:ilvl="6" w:tentative="1">
+      <w:start w:val="1"/>
+      <w:numFmt w:val="decimal"/>
+      <w:lvlText w:val="%7."/>
+      <w:lvlJc w:val="left"/>
+      <w:pPr>
+        <w:tabs>
+          <w:tab w:val="num" w:pos="5040"/>
+        </w:tabs>
+        <w:ind w:left="5040" w:hanging="360"/>
+      </w:pPr>
+    </w:lvl>
+    <w:lvl w:ilvl="7" w:tentative="1">
+      <w:start w:val="1"/>
+      <w:numFmt w:val="decimal"/>
+      <w:lvlText w:val="%8."/>
+      <w:lvlJc w:val="left"/>
+      <w:pPr>
+        <w:tabs>
+          <w:tab w:val="num" w:pos="5760"/>
+        </w:tabs>
+        <w:ind w:left="5760" w:hanging="360"/>
+      </w:pPr>
+    </w:lvl>
+    <w:lvl w:ilvl="8" w:tentative="1">
+      <w:start w:val="1"/>
+      <w:numFmt w:val="decimal"/>
+      <w:lvlText w:val="%9."/>
+      <w:lvlJc w:val="left"/>
+      <w:pPr>
+        <w:tabs>
+          <w:tab w:val="num" w:pos="6480"/>
+        </w:tabs>
+        <w:ind w:left="6480" w:hanging="360"/>
+      </w:pPr>
+    </w:lvl>
+  </w:abstractNum>
+  <w:abstractNum w:abstractNumId="14" w15:restartNumberingAfterBreak="0">
     <w:nsid w:val="77A965E7"/>
     <w:multiLevelType w:val="multilevel"/>
     <w:tmpl w:val="50AEABF8"/>
@@ -3436,7 +3875,7 @@
       </w:pPr>
     </w:lvl>
   </w:abstractNum>
-  <w:abstractNum w:abstractNumId="14" w15:restartNumberingAfterBreak="0">
+  <w:abstractNum w:abstractNumId="15" w15:restartNumberingAfterBreak="0">
     <w:nsid w:val="7CDA7AD5"/>
     <w:multiLevelType w:val="multilevel"/>
     <w:tmpl w:val="18282BCC"/>
@@ -3554,10 +3993,10 @@
     </w:lvl>
   </w:abstractNum>
   <w:num w:numId="1" w16cid:durableId="1240405192">
-    <w:abstractNumId w:val="14"/>
+    <w:abstractNumId w:val="15"/>
   </w:num>
   <w:num w:numId="2" w16cid:durableId="1572958410">
-    <w:abstractNumId w:val="13"/>
+    <w:abstractNumId w:val="14"/>
   </w:num>
   <w:num w:numId="3" w16cid:durableId="649557712">
     <w:abstractNumId w:val="5"/>
@@ -3597,6 +4036,9 @@
   </w:num>
   <w:num w:numId="15" w16cid:durableId="1895121047">
     <w:abstractNumId w:val="9"/>
+  </w:num>
+  <w:num w:numId="16" w16cid:durableId="1291934294">
+    <w:abstractNumId w:val="13"/>
   </w:num>
 </w:numbering>
 </file>
@@ -3997,6 +4439,7 @@
   <w:style w:type="paragraph" w:default="1" w:styleId="a">
     <w:name w:val="Normal"/>
     <w:qFormat/>
+    <w:rsid w:val="00E64E29"/>
     <w:pPr>
       <w:widowControl w:val="0"/>
       <w:jc w:val="both"/>
@@ -4203,7 +4646,6 @@
   <w:style w:type="character" w:default="1" w:styleId="a0">
     <w:name w:val="Default Paragraph Font"/>
     <w:uiPriority w:val="1"/>
-    <w:semiHidden/>
     <w:unhideWhenUsed/>
   </w:style>
   <w:style w:type="table" w:default="1" w:styleId="a1">
@@ -4558,6 +5000,29 @@
     <w:uiPriority w:val="99"/>
     <w:rsid w:val="006C179F"/>
   </w:style>
+  <w:style w:type="character" w:styleId="ae">
+    <w:name w:val="Hyperlink"/>
+    <w:basedOn w:val="a0"/>
+    <w:uiPriority w:val="99"/>
+    <w:unhideWhenUsed/>
+    <w:rsid w:val="005D5D19"/>
+    <w:rPr>
+      <w:color w:val="467886" w:themeColor="hyperlink"/>
+      <w:u w:val="single"/>
+    </w:rPr>
+  </w:style>
+  <w:style w:type="character" w:styleId="af">
+    <w:name w:val="Unresolved Mention"/>
+    <w:basedOn w:val="a0"/>
+    <w:uiPriority w:val="99"/>
+    <w:semiHidden/>
+    <w:unhideWhenUsed/>
+    <w:rsid w:val="005D5D19"/>
+    <w:rPr>
+      <w:color w:val="605E5C"/>
+      <w:shd w:val="clear" w:color="auto" w:fill="E1DFDD"/>
+    </w:rPr>
+  </w:style>
 </w:styles>
 </file>
 

</xml_diff>